<commit_message>
Update Looogen 备案材料 per product doc (AI影视制作Agent)
Co-Authored-By: Claude Opus 5.5 <noreply@anthropic.com>
Claude-Session: https://claude.ai/code/session_019t6qcYjnoTfJn5S6eVPG1c
</commit_message>
<xml_diff>
--- a/looogen-备案材料/大模型备案申报材料-北京优酷科技有限公司-Looogen/0-生成式人工智能大模型上线备案表/0-生成式人工智能大模型上线备案表.docx
+++ b/looogen-备案材料/大模型备案申报材料-北京优酷科技有限公司-Looogen/0-生成式人工智能大模型上线备案表/0-生成式人工智能大模型上线备案表.docx
@@ -1810,17 +1810,6 @@
               <w:t>代码生成或优化</w:t>
             </w:r>
           </w:p>
-          <w:p>
-            <w:r>
-              <w:rPr>
-                <w:rFonts w:ascii="仿宋" w:hAnsi="仿宋" w:eastAsia="仿宋" w:cs="仿宋"/>
-                <w:b w:val="0"/>
-                <w:color w:val="FF0000"/>
-                <w:sz w:val="24"/>
-              </w:rPr>
-              <w:t>【待确认：以下功能参照虎鲸AI暂填（文本、图片、视频、音频生成与编辑），请按Looogen实际功能增删】</w:t>
-            </w:r>
-          </w:p>
         </w:tc>
       </w:tr>
       <w:tr>
@@ -1892,24 +1881,7 @@
                 <w:b w:val="0"/>
                 <w:sz w:val="24"/>
               </w:rPr>
-              <w:t>本服务仅面向年满18周岁、具备完全民事行为能力的成年用户（主要为</w:t>
-            </w:r>
-            <w:r>
-              <w:rPr>
-                <w:rFonts w:ascii="仿宋" w:hAnsi="仿宋" w:eastAsia="仿宋" w:cs="仿宋"/>
-                <w:b w:val="0"/>
-                <w:color w:val="FF0000"/>
-                <w:sz w:val="24"/>
-              </w:rPr>
-              <w:t>【待确认：目标用户，如影视/广告/内容创作从业者及专业创作者】</w:t>
-            </w:r>
-            <w:r>
-              <w:rPr>
-                <w:rFonts w:ascii="仿宋" w:hAnsi="仿宋" w:eastAsia="仿宋" w:cs="仿宋"/>
-                <w:b w:val="0"/>
-                <w:sz w:val="24"/>
-              </w:rPr>
-              <w:t>），不适用于未成年人（含未成年学生）。通过以下管理制度和技术措施判断用户是否为未成年人：（1）《用户服务协议》《隐私政策》显著声明本服务不面向未成年人；（2）用户须使用经运营商实名登记的手机号+短信验证码注册登录；（3）结合用户主动反馈、投诉举报及账号行为特征识别疑似未成年人账号，经核实后限制使用或注销账号、删除相关个人信息。详见附件7。</w:t>
+              <w:t>本服务面向短剧制作团队、影视内容创作者、MCN机构等专业用户，仅向年满18周岁、具备完全民事行为能力的成年人提供服务，不适用于未成年人（含未成年学生）。通过以下管理制度和技术措施判断用户是否为未成年人：（1）《用户服务协议》《隐私政策》显著声明本服务不面向未成年人；（2）用户须使用经运营商实名登记的手机号+短信验证码注册登录；（3）结合用户主动反馈、投诉举报及账号行为特征识别疑似未成年人账号，经核实后限制使用或注销账号、删除相关个人信息。详见附件7。</w:t>
             </w:r>
           </w:p>
         </w:tc>
@@ -2266,7 +2238,7 @@
                 <w:b w:val="0"/>
                 <w:sz w:val="28"/>
               </w:rPr>
-              <w:t>辅助内容创作的文字、图片、音视频生成与编辑</w:t>
+              <w:t>短剧/影视内容AI辅助制作（剧本、图片、视频、音频生成与编辑）</w:t>
             </w:r>
           </w:p>
         </w:tc>
@@ -2332,7 +2304,7 @@
                 <w:b w:val="0"/>
                 <w:sz w:val="24"/>
               </w:rPr>
-              <w:t>具体说明：Looogen用于辅助内容创作的文字、图片、视频、音频生成与编辑，不适用于自动控制、医疗信息服务、心理咨询、关键信息基础设施等场合。</w:t>
+              <w:t>具体说明：Looogen用于短剧、影视内容的AI辅助制作，包括剧本创作与解析、角色/场景资产设计、分镜生成、视频生成、配音配乐及后期处理，不适用于自动控制、医疗信息服务、心理咨询、关键信息基础设施等场合。</w:t>
             </w:r>
           </w:p>
         </w:tc>
@@ -2515,16 +2487,7 @@
                 <w:b w:val="0"/>
                 <w:sz w:val="24"/>
               </w:rPr>
-              <w:t>限定于内容创作领域（AI辅助创作）。Looogen是北京优酷科技有限公司推出的生成式人工智能内容创作服务，面向成年专业创作者提供AI文本生成、AI图片生成与编辑、AI视频生成与编辑、AI音频生成等能力，辅助用户完成内容创作。</w:t>
-            </w:r>
-            <w:r>
-              <w:rPr>
-                <w:rFonts w:ascii="仿宋" w:hAnsi="仿宋" w:eastAsia="仿宋" w:cs="仿宋"/>
-                <w:b w:val="0"/>
-                <w:color w:val="FF0000"/>
-                <w:sz w:val="24"/>
-              </w:rPr>
-              <w:t>【待确认：以下功能参照虎鲸AI暂填（文本、图片、视频、音频生成与编辑），请按Looogen实际功能增删】</w:t>
+              <w:t>限定于短剧/影视内容制作领域。Looogen是北京优酷科技有限公司推出的AI影视制作Agent产品，面向短剧制作团队、影视内容创作者、MCN机构等专业用户，提供从剧本创作与解析、角色/服装/场景资产设计、分镜生成、视频生成与质检修复、配音配乐到后期处理的全链路AI影视制作能力，帮助用户解决AI视频生成流程中人工干预多、生成效率低、人物/场景前后不一致、废片率高、制作成本高等问题。产品分为Agent模块（一句话创意或剧本一键直出成片的全链路模式）和影视套件模块（按制作步骤分别调用的工具集）。</w:t>
             </w:r>
           </w:p>
           <w:p>
@@ -2556,47 +2519,67 @@
                 <w:b w:val="0"/>
                 <w:sz w:val="24"/>
               </w:rPr>
-              <w:t>在Looogen中，涉及AI模型的主要功能如下：</w:t>
-            </w:r>
-          </w:p>
-          <w:p>
-            <w:r>
-              <w:rPr>
-                <w:rFonts w:ascii="仿宋" w:hAnsi="仿宋" w:eastAsia="仿宋" w:cs="仿宋"/>
-                <w:b w:val="0"/>
-                <w:sz w:val="24"/>
-              </w:rPr>
-              <w:t>1. AI文本生成：根据用户输入的提示词或素材，生成或优化创作所需的文字内容（如创意文案、脚本、分镜描述等）。</w:t>
-            </w:r>
-          </w:p>
-          <w:p>
-            <w:r>
-              <w:rPr>
-                <w:rFonts w:ascii="仿宋" w:hAnsi="仿宋" w:eastAsia="仿宋" w:cs="仿宋"/>
-                <w:b w:val="0"/>
-                <w:sz w:val="24"/>
-              </w:rPr>
-              <w:t>2. AI图片生成与编辑：根据用户输入的文字或参考图生成图片，并提供局部重绘、扩图、风格调整等编辑能力。</w:t>
-            </w:r>
-          </w:p>
-          <w:p>
-            <w:r>
-              <w:rPr>
-                <w:rFonts w:ascii="仿宋" w:hAnsi="仿宋" w:eastAsia="仿宋" w:cs="仿宋"/>
-                <w:b w:val="0"/>
-                <w:sz w:val="24"/>
-              </w:rPr>
-              <w:t>3. AI视频生成与编辑：根据用户输入的文字、图片或视频素材生成视频，并提供视频编辑能力。</w:t>
-            </w:r>
-          </w:p>
-          <w:p>
-            <w:r>
-              <w:rPr>
-                <w:rFonts w:ascii="仿宋" w:hAnsi="仿宋" w:eastAsia="仿宋" w:cs="仿宋"/>
-                <w:b w:val="0"/>
-                <w:sz w:val="24"/>
-              </w:rPr>
-              <w:t>4. AI音频生成：根据用户输入的文本生成配音、音效等音频内容。</w:t>
+              <w:t>Looogen涉及AI模型的主要功能模块如下：</w:t>
+            </w:r>
+          </w:p>
+          <w:p>
+            <w:r>
+              <w:rPr>
+                <w:rFonts w:ascii="仿宋" w:hAnsi="仿宋" w:eastAsia="仿宋" w:cs="仿宋"/>
+                <w:b w:val="0"/>
+                <w:sz w:val="24"/>
+              </w:rPr>
+              <w:t>1. 剧本创作与解析：支持从一句话创意AI辅助生成完整剧本；对用户上传的剧本自动评估质量，解析世界观、时间线、人物关系等结构信息；对用户上传的参考视频反向拆解输出分镜表（拉片）。（剧本采买为剧本素材交易通道，不涉及AI生成）</w:t>
+            </w:r>
+          </w:p>
+          <w:p>
+            <w:r>
+              <w:rPr>
+                <w:rFonts w:ascii="仿宋" w:hAnsi="仿宋" w:eastAsia="仿宋" w:cs="仿宋"/>
+                <w:b w:val="0"/>
+                <w:sz w:val="24"/>
+              </w:rPr>
+              <w:t>2. 资产库与资产设计：内置影视级AI演员、服装、场景资产库；根据剧本角色生成/匹配演员形象与妆造，生成角色及场景三视图/多视图，支持无损换装、换光线、资产变体等图片生成与编辑。</w:t>
+            </w:r>
+          </w:p>
+          <w:p>
+            <w:r>
+              <w:rPr>
+                <w:rFonts w:ascii="仿宋" w:hAnsi="仿宋" w:eastAsia="仿宋" w:cs="仿宋"/>
+                <w:b w:val="0"/>
+                <w:sz w:val="24"/>
+              </w:rPr>
+              <w:t>3. 分镜生成：基于解析后的剧本自动生成覆盖景别、运镜、构图、站位、光影、表演要素的分镜表，自动注入角色/场景资产，支持人工编辑与智能质检。</w:t>
+            </w:r>
+          </w:p>
+          <w:p>
+            <w:r>
+              <w:rPr>
+                <w:rFonts w:ascii="仿宋" w:hAnsi="仿宋" w:eastAsia="仿宋" w:cs="仿宋"/>
+                <w:b w:val="0"/>
+                <w:sz w:val="24"/>
+              </w:rPr>
+              <w:t>4. 视频生成与质检修复：基于分镜表逐镜头生成视频并自动合成含画面、配音、配乐、字幕的成片（单次最长5分钟），自动检测人物变形、轴线错误、前后不一致等问题并定向修复，支持单镜头重生成及多集批量生成。</w:t>
+            </w:r>
+          </w:p>
+          <w:p>
+            <w:r>
+              <w:rPr>
+                <w:rFonts w:ascii="仿宋" w:hAnsi="仿宋" w:eastAsia="仿宋" w:cs="仿宋"/>
+                <w:b w:val="0"/>
+                <w:sz w:val="24"/>
+              </w:rPr>
+              <w:t>5. 配音与配乐：多角色智能配音（内置音色库）、音色替换、BGM生成与自动适配、音效生成，以及人声增强、底噪修复、环绕声处理等音频增强。</w:t>
+            </w:r>
+          </w:p>
+          <w:p>
+            <w:r>
+              <w:rPr>
+                <w:rFonts w:ascii="仿宋" w:hAnsi="仿宋" w:eastAsia="仿宋" w:cs="仿宋"/>
+                <w:b w:val="0"/>
+                <w:sz w:val="24"/>
+              </w:rPr>
+              <w:t>6. 后期处理：超分辨率、插帧、HDR等画面增强，自动生成与配音对齐的时间轴字幕，成片可一键导入剪辑软件。</w:t>
             </w:r>
           </w:p>
         </w:tc>
@@ -14950,7 +14933,7 @@
                 <w:b w:val="0"/>
                 <w:sz w:val="24"/>
               </w:rPr>
-              <w:t>4. 用户主动上传或输入的素材与指令（文本、图片、音视频）及为此调用的剪切板、本地磁盘读取权限</w:t>
+              <w:t>4. 用户主动上传或输入的素材与指令（剧本、创意文本、参考图、参考视频、音频）及为此调用的剪切板、本地磁盘读取权限</w:t>
             </w:r>
           </w:p>
           <w:p>
@@ -15211,7 +15194,7 @@
                 <w:b w:val="0"/>
                 <w:sz w:val="24"/>
               </w:rPr>
-              <w:t>4. 用户主动上传或输入的素材与指令（文本、图片、音视频）及为此调用的剪切板、本地磁盘读取权限：实现AI文本/图片/视频/音频生成与编辑等功能</w:t>
+              <w:t>4. 用户主动上传或输入的素材与指令（剧本、创意文本、参考图、参考视频、音频）及为此调用的剪切板、本地磁盘读取权限：实现剧本解析、拉片、资产生成、分镜生成、视频生成、配音配乐及后期处理等功能</w:t>
             </w:r>
           </w:p>
           <w:p>
@@ -15900,7 +15883,7 @@
                 <w:b w:val="0"/>
                 <w:sz w:val="24"/>
               </w:rPr>
-              <w:t>显式标识：平台展示及下载的AI生成图片、视频右下角添加“AI生成”文字标识</w:t>
+              <w:t>显式标识：平台展示及下载（含一键导入剪辑软件）的AI生成图片、视频（含成片及经画面增强处理的视频）右下角添加“AI生成”文字标识</w:t>
             </w:r>
             <w:r>
               <w:rPr>

</xml_diff>